<commit_message>
docs: add social identity providers (Google, Apple, Microsoft/Outlook, Facebook) across SRS, hosting doc & diagrams
- SRS AUTH-002 expanded with social IdPs (+ Apple sign-in App Store note)
- Hosting doc identity briefs (component + security layer) updated
- Both architecture diagrams: Entra External ID node now lists the providers
- Docx regenerated; revision history bumped (SRS 1.0.1, Hosting 1.1); footers re-applied

Co-Authored-By: Claude Opus 4.8 <noreply@anthropic.com>
</commit_message>
<xml_diff>
--- a/docs/Hosting-Architecture-OneEdu.docx
+++ b/docs/Hosting-Architecture-OneEdu.docx
@@ -198,7 +198,7 @@
               <w:pStyle w:val="Compact"/>
             </w:pPr>
             <w:r>
-              <w:t xml:space="preserve">1.0</w:t>
+              <w:t xml:space="preserve">1.1</w:t>
             </w:r>
           </w:p>
         </w:tc>
@@ -480,6 +480,52 @@
           </w:p>
         </w:tc>
       </w:tr>
+      <w:tr>
+        <w:tc>
+          <w:tcPr/>
+          <w:p>
+            <w:pPr>
+              <w:pStyle w:val="Compact"/>
+            </w:pPr>
+            <w:r>
+              <w:t xml:space="preserve">1.1</w:t>
+            </w:r>
+          </w:p>
+        </w:tc>
+        <w:tc>
+          <w:tcPr/>
+          <w:p>
+            <w:pPr>
+              <w:pStyle w:val="Compact"/>
+            </w:pPr>
+            <w:r>
+              <w:t xml:space="preserve">June 2026</w:t>
+            </w:r>
+          </w:p>
+        </w:tc>
+        <w:tc>
+          <w:tcPr/>
+          <w:p>
+            <w:pPr>
+              <w:pStyle w:val="Compact"/>
+            </w:pPr>
+            <w:r>
+              <w:t xml:space="preserve">Architecture Team</w:t>
+            </w:r>
+          </w:p>
+        </w:tc>
+        <w:tc>
+          <w:tcPr/>
+          <w:p>
+            <w:pPr>
+              <w:pStyle w:val="Compact"/>
+            </w:pPr>
+            <w:r>
+              <w:t xml:space="preserve">Identity briefs + diagrams updated with social providers (Google, Apple, Microsoft/Outlook, Facebook).</w:t>
+            </w:r>
+          </w:p>
+        </w:tc>
+      </w:tr>
     </w:tbl>
     <w:p>
       <w:r>
@@ -1244,7 +1290,7 @@
       <w:r>
         <w:drawing>
           <wp:inline>
-            <wp:extent cx="5334000" cy="3000473"/>
+            <wp:extent cx="5334000" cy="3060388"/>
             <wp:effectExtent b="0" l="0" r="0" t="0"/>
             <wp:docPr descr="Single-region hosting architecture for One Edu" title="" id="16" name="Picture"/>
             <a:graphic>
@@ -1265,7 +1311,7 @@
                   <pic:spPr bwMode="auto">
                     <a:xfrm>
                       <a:off x="0" y="0"/>
-                      <a:ext cx="5334000" cy="3000473"/>
+                      <a:ext cx="5334000" cy="3060388"/>
                     </a:xfrm>
                     <a:prstGeom prst="rect">
                       <a:avLst/>
@@ -1776,7 +1822,23 @@
               <w:pStyle w:val="Compact"/>
             </w:pPr>
             <w:r>
-              <w:t xml:space="preserve">Customer sign-in, social/SSO federation, and enforced MFA for staff/admins.</w:t>
+              <w:t xml:space="preserve">Sign-in with</w:t>
+            </w:r>
+            <w:r>
+              <w:t xml:space="preserve"> </w:t>
+            </w:r>
+            <w:r>
+              <w:rPr>
+                <w:b/>
+                <w:bCs/>
+              </w:rPr>
+              <w:t xml:space="preserve">social logins (Google, Apple, Microsoft/Outlook, Facebook)</w:t>
+            </w:r>
+            <w:r>
+              <w:t xml:space="preserve"> </w:t>
+            </w:r>
+            <w:r>
+              <w:t xml:space="preserve">+ enterprise SSO; enforced MFA for staff/admins.</w:t>
             </w:r>
           </w:p>
         </w:tc>
@@ -2622,7 +2684,7 @@
       <w:r>
         <w:drawing>
           <wp:inline>
-            <wp:extent cx="5334000" cy="1906925"/>
+            <wp:extent cx="5334000" cy="1951463"/>
             <wp:effectExtent b="0" l="0" r="0" t="0"/>
             <wp:docPr descr="Multi-region, multi-tenant hosting architecture for One Edu" title="" id="24" name="Picture"/>
             <a:graphic>
@@ -2643,7 +2705,7 @@
                   <pic:spPr bwMode="auto">
                     <a:xfrm>
                       <a:off x="0" y="0"/>
-                      <a:ext cx="5334000" cy="1906925"/>
+                      <a:ext cx="5334000" cy="1951463"/>
                     </a:xfrm>
                     <a:prstGeom prst="rect">
                       <a:avLst/>
@@ -3324,7 +3386,7 @@
               <w:pStyle w:val="Compact"/>
             </w:pPr>
             <w:r>
-              <w:t xml:space="preserve">Multi-factor authentication for staff/admins, federated SSO, conditional access; just-in-time (</w:t>
+              <w:t xml:space="preserve">Social sign-in (Google, Apple, Microsoft/Outlook, Facebook) + enterprise SSO; multi-factor authentication for staff/admins; conditional access; just-in-time (</w:t>
             </w:r>
             <w:r>
               <w:t xml:space="preserve">“break-glass”</w:t>

</xml_diff>